<commit_message>
Initial ReportPeer AI implementation2
</commit_message>
<xml_diff>
--- a/actual-app/apps/engine/tools/generated_front3_official_test.docx
+++ b/actual-app/apps/engine/tools/generated_front3_official_test.docx
@@ -31,7 +31,7 @@
           <w:noProof/>
         </w:rPr>
         <w:drawing>
-          <wp:inline distT="0" distB="0" distL="0" distR="0" wp14:anchorId="0648D94F" wp14:editId="33C56911">
+          <wp:inline distT="0" distB="0" distL="0" distR="0" wp14:anchorId="3FB97AF9" wp14:editId="49AF7C98">
             <wp:extent cx="1133856" cy="1225296"/>
             <wp:effectExtent l="0" t="0" r="0" b="0"/>
             <wp:docPr id="1" name="Picture 1"/>
@@ -42,7 +42,7 @@
               <a:graphicData uri="http://schemas.openxmlformats.org/drawingml/2006/picture">
                 <pic:pic xmlns:pic="http://schemas.openxmlformats.org/drawingml/2006/picture">
                   <pic:nvPicPr>
-                    <pic:cNvPr id="0" name="tmprqd1bkr8.png"/>
+                    <pic:cNvPr id="0" name="tmpiqaikwif.png"/>
                     <pic:cNvPicPr/>
                   </pic:nvPicPr>
                   <pic:blipFill>
@@ -99,163 +99,35 @@
           <w:tab w:val="left" w:pos="2880"/>
           <w:tab w:val="left" w:pos="6480"/>
         </w:tabs>
-        <w:spacing w:line="360" w:lineRule="auto" w:before="0" w:after="0"/>
-        <w:ind w:left="0" w:firstLine="720"/>
-        <w:jc w:val="both"/>
-      </w:pPr>
-      <w:r>
-        <w:rPr>
-          <w:rFonts w:ascii="Times New Roman" w:hAnsi="Times New Roman" w:eastAsia="Times New Roman" w:cs="Times New Roman"/>
+        <w:spacing w:after="40" w:line="240" w:lineRule="auto"/>
+        <w:jc w:val="left"/>
+      </w:pPr>
+      <w:r>
+        <w:rPr>
           <w:b/>
-          <w:sz w:val="24"/>
-          <w:szCs w:val="24"/>
+          <w:sz w:val="26"/>
         </w:rPr>
         <w:t>Name</w:t>
       </w:r>
       <w:r>
-        <w:rPr>
-          <w:rFonts w:ascii="Times New Roman" w:hAnsi="Times New Roman" w:eastAsia="Times New Roman" w:cs="Times New Roman"/>
-          <w:sz w:val="24"/>
-          <w:szCs w:val="24"/>
-        </w:rPr>
         <w:tab/>
       </w:r>
       <w:r>
         <w:rPr>
-          <w:rFonts w:ascii="Times New Roman" w:hAnsi="Times New Roman" w:eastAsia="Times New Roman" w:cs="Times New Roman"/>
           <w:b/>
-          <w:sz w:val="24"/>
-          <w:szCs w:val="24"/>
+          <w:sz w:val="26"/>
         </w:rPr>
         <w:t>Enrolment</w:t>
       </w:r>
       <w:r>
-        <w:rPr>
-          <w:rFonts w:ascii="Times New Roman" w:hAnsi="Times New Roman" w:eastAsia="Times New Roman" w:cs="Times New Roman"/>
-          <w:sz w:val="24"/>
-          <w:szCs w:val="24"/>
-        </w:rPr>
         <w:tab/>
       </w:r>
       <w:r>
         <w:rPr>
-          <w:rFonts w:ascii="Times New Roman" w:hAnsi="Times New Roman" w:eastAsia="Times New Roman" w:cs="Times New Roman"/>
           <w:b/>
-          <w:sz w:val="24"/>
-          <w:szCs w:val="24"/>
+          <w:sz w:val="26"/>
         </w:rPr>
         <w:t>Seat number</w:t>
-      </w:r>
-    </w:p>
-    <w:p>
-      <w:pPr>
-        <w:tabs>
-          <w:tab w:val="left" w:pos="2880"/>
-          <w:tab w:val="left" w:pos="6480"/>
-        </w:tabs>
-        <w:spacing w:line="360" w:lineRule="auto" w:before="0" w:after="0"/>
-        <w:ind w:left="0" w:firstLine="720"/>
-        <w:jc w:val="both"/>
-      </w:pPr>
-      <w:r>
-        <w:rPr>
-          <w:rFonts w:ascii="Times New Roman" w:hAnsi="Times New Roman" w:eastAsia="Times New Roman" w:cs="Times New Roman"/>
-          <w:sz w:val="24"/>
-          <w:szCs w:val="24"/>
-        </w:rPr>
-        <w:t>Muskan Fatima</w:t>
-      </w:r>
-      <w:r>
-        <w:rPr>
-          <w:rFonts w:ascii="Times New Roman" w:hAnsi="Times New Roman" w:eastAsia="Times New Roman" w:cs="Times New Roman"/>
-          <w:sz w:val="24"/>
-          <w:szCs w:val="24"/>
-        </w:rPr>
-        <w:tab/>
-        <w:t>CS2021-01</w:t>
-      </w:r>
-      <w:r>
-        <w:rPr>
-          <w:rFonts w:ascii="Times New Roman" w:hAnsi="Times New Roman" w:eastAsia="Times New Roman" w:cs="Times New Roman"/>
-          <w:sz w:val="24"/>
-          <w:szCs w:val="24"/>
-        </w:rPr>
-        <w:tab/>
-        <w:t>21045</w:t>
-      </w:r>
-    </w:p>
-    <w:p>
-      <w:pPr>
-        <w:tabs>
-          <w:tab w:val="left" w:pos="2880"/>
-          <w:tab w:val="left" w:pos="6480"/>
-        </w:tabs>
-        <w:spacing w:line="360" w:lineRule="auto" w:before="0" w:after="0"/>
-        <w:ind w:left="0" w:firstLine="720"/>
-        <w:jc w:val="both"/>
-      </w:pPr>
-      <w:r>
-        <w:rPr>
-          <w:rFonts w:ascii="Times New Roman" w:hAnsi="Times New Roman" w:eastAsia="Times New Roman" w:cs="Times New Roman"/>
-          <w:sz w:val="24"/>
-          <w:szCs w:val="24"/>
-        </w:rPr>
-        <w:t>Sumayya Khan</w:t>
-      </w:r>
-      <w:r>
-        <w:rPr>
-          <w:rFonts w:ascii="Times New Roman" w:hAnsi="Times New Roman" w:eastAsia="Times New Roman" w:cs="Times New Roman"/>
-          <w:sz w:val="24"/>
-          <w:szCs w:val="24"/>
-        </w:rPr>
-        <w:tab/>
-        <w:t>CS2021-02</w:t>
-      </w:r>
-      <w:r>
-        <w:rPr>
-          <w:rFonts w:ascii="Times New Roman" w:hAnsi="Times New Roman" w:eastAsia="Times New Roman" w:cs="Times New Roman"/>
-          <w:sz w:val="24"/>
-          <w:szCs w:val="24"/>
-        </w:rPr>
-        <w:tab/>
-        <w:t>21052</w:t>
-      </w:r>
-    </w:p>
-    <w:p>
-      <w:pPr>
-        <w:tabs>
-          <w:tab w:val="left" w:pos="2880"/>
-          <w:tab w:val="left" w:pos="6480"/>
-        </w:tabs>
-        <w:spacing w:line="360" w:lineRule="auto" w:before="0" w:after="0"/>
-        <w:ind w:left="0" w:firstLine="720"/>
-        <w:jc w:val="both"/>
-      </w:pPr>
-      <w:r>
-        <w:rPr>
-          <w:rFonts w:ascii="Times New Roman" w:hAnsi="Times New Roman" w:eastAsia="Times New Roman" w:cs="Times New Roman"/>
-          <w:sz w:val="24"/>
-          <w:szCs w:val="24"/>
-        </w:rPr>
-        <w:t>Habiba Ali</w:t>
-      </w:r>
-      <w:r>
-        <w:rPr>
-          <w:rFonts w:ascii="Times New Roman" w:hAnsi="Times New Roman" w:eastAsia="Times New Roman" w:cs="Times New Roman"/>
-          <w:sz w:val="24"/>
-          <w:szCs w:val="24"/>
-        </w:rPr>
-        <w:tab/>
-        <w:t>CS2021-03</w:t>
-      </w:r>
-      <w:r>
-        <w:rPr>
-          <w:rFonts w:ascii="Times New Roman" w:hAnsi="Times New Roman" w:eastAsia="Times New Roman" w:cs="Times New Roman"/>
-          <w:sz w:val="24"/>
-          <w:szCs w:val="24"/>
-        </w:rPr>
-        <w:tab/>
-        <w:t>21060</w:t>
       </w:r>
     </w:p>
     <w:p>
@@ -268,6 +140,108 @@
         <w:jc w:val="left"/>
       </w:pPr>
       <w:r>
+        <w:rPr>
+          <w:sz w:val="26"/>
+        </w:rPr>
+        <w:t>Muskan Fatima</w:t>
+      </w:r>
+      <w:r>
+        <w:tab/>
+      </w:r>
+      <w:r>
+        <w:rPr>
+          <w:sz w:val="26"/>
+        </w:rPr>
+        <w:t>CS2021-01</w:t>
+      </w:r>
+      <w:r>
+        <w:tab/>
+      </w:r>
+      <w:r>
+        <w:rPr>
+          <w:sz w:val="26"/>
+        </w:rPr>
+        <w:t>21045</w:t>
+      </w:r>
+    </w:p>
+    <w:p>
+      <w:pPr>
+        <w:tabs>
+          <w:tab w:val="left" w:pos="2880"/>
+          <w:tab w:val="left" w:pos="6480"/>
+        </w:tabs>
+        <w:spacing w:after="40" w:line="240" w:lineRule="auto"/>
+        <w:jc w:val="left"/>
+      </w:pPr>
+      <w:r>
+        <w:rPr>
+          <w:sz w:val="26"/>
+        </w:rPr>
+        <w:t>Sumayya Khan</w:t>
+      </w:r>
+      <w:r>
+        <w:tab/>
+      </w:r>
+      <w:r>
+        <w:rPr>
+          <w:sz w:val="26"/>
+        </w:rPr>
+        <w:t>CS2021-02</w:t>
+      </w:r>
+      <w:r>
+        <w:tab/>
+      </w:r>
+      <w:r>
+        <w:rPr>
+          <w:sz w:val="26"/>
+        </w:rPr>
+        <w:t>21052</w:t>
+      </w:r>
+    </w:p>
+    <w:p>
+      <w:pPr>
+        <w:tabs>
+          <w:tab w:val="left" w:pos="2880"/>
+          <w:tab w:val="left" w:pos="6480"/>
+        </w:tabs>
+        <w:spacing w:after="40" w:line="240" w:lineRule="auto"/>
+        <w:jc w:val="left"/>
+      </w:pPr>
+      <w:r>
+        <w:rPr>
+          <w:sz w:val="26"/>
+        </w:rPr>
+        <w:t>Habiba Ali</w:t>
+      </w:r>
+      <w:r>
+        <w:tab/>
+      </w:r>
+      <w:r>
+        <w:rPr>
+          <w:sz w:val="26"/>
+        </w:rPr>
+        <w:t>CS2021-03</w:t>
+      </w:r>
+      <w:r>
+        <w:tab/>
+      </w:r>
+      <w:r>
+        <w:rPr>
+          <w:sz w:val="26"/>
+        </w:rPr>
+        <w:t>21060</w:t>
+      </w:r>
+    </w:p>
+    <w:p>
+      <w:pPr>
+        <w:tabs>
+          <w:tab w:val="left" w:pos="2880"/>
+          <w:tab w:val="left" w:pos="6480"/>
+        </w:tabs>
+        <w:spacing w:after="40" w:line="240" w:lineRule="auto"/>
+        <w:jc w:val="left"/>
+      </w:pPr>
+      <w:r>
         <w:tab/>
       </w:r>
       <w:r>
@@ -371,171 +345,6 @@
           <w:sz w:val="26"/>
         </w:rPr>
         <w:t>Submitted by</w:t>
-      </w:r>
-    </w:p>
-    <w:p>
-      <w:pPr>
-        <w:tabs>
-          <w:tab w:val="left" w:pos="2160"/>
-          <w:tab w:val="left" w:pos="5040"/>
-        </w:tabs>
-        <w:spacing w:line="360" w:lineRule="auto" w:before="0" w:after="0"/>
-        <w:ind w:left="0" w:firstLine="720"/>
-        <w:jc w:val="both"/>
-      </w:pPr>
-      <w:r>
-        <w:rPr>
-          <w:rFonts w:ascii="Times New Roman" w:hAnsi="Times New Roman" w:eastAsia="Times New Roman" w:cs="Times New Roman"/>
-          <w:b/>
-          <w:sz w:val="24"/>
-          <w:szCs w:val="24"/>
-        </w:rPr>
-        <w:t>Name</w:t>
-      </w:r>
-      <w:r>
-        <w:rPr>
-          <w:rFonts w:ascii="Times New Roman" w:hAnsi="Times New Roman" w:eastAsia="Times New Roman" w:cs="Times New Roman"/>
-          <w:sz w:val="24"/>
-          <w:szCs w:val="24"/>
-        </w:rPr>
-        <w:tab/>
-      </w:r>
-      <w:r>
-        <w:rPr>
-          <w:rFonts w:ascii="Times New Roman" w:hAnsi="Times New Roman" w:eastAsia="Times New Roman" w:cs="Times New Roman"/>
-          <w:b/>
-          <w:sz w:val="24"/>
-          <w:szCs w:val="24"/>
-        </w:rPr>
-        <w:t>Enrolment</w:t>
-      </w:r>
-      <w:r>
-        <w:rPr>
-          <w:rFonts w:ascii="Times New Roman" w:hAnsi="Times New Roman" w:eastAsia="Times New Roman" w:cs="Times New Roman"/>
-          <w:sz w:val="24"/>
-          <w:szCs w:val="24"/>
-        </w:rPr>
-        <w:tab/>
-      </w:r>
-      <w:r>
-        <w:rPr>
-          <w:rFonts w:ascii="Times New Roman" w:hAnsi="Times New Roman" w:eastAsia="Times New Roman" w:cs="Times New Roman"/>
-          <w:b/>
-          <w:sz w:val="24"/>
-          <w:szCs w:val="24"/>
-        </w:rPr>
-        <w:t>Seat number</w:t>
-      </w:r>
-    </w:p>
-    <w:p>
-      <w:pPr>
-        <w:tabs>
-          <w:tab w:val="left" w:pos="2160"/>
-          <w:tab w:val="left" w:pos="5040"/>
-        </w:tabs>
-        <w:spacing w:line="360" w:lineRule="auto" w:before="0" w:after="0"/>
-        <w:ind w:left="0" w:firstLine="720"/>
-        <w:jc w:val="both"/>
-      </w:pPr>
-      <w:r>
-        <w:rPr>
-          <w:rFonts w:ascii="Times New Roman" w:hAnsi="Times New Roman" w:eastAsia="Times New Roman" w:cs="Times New Roman"/>
-          <w:sz w:val="24"/>
-          <w:szCs w:val="24"/>
-        </w:rPr>
-        <w:t>Muskan Fatima</w:t>
-      </w:r>
-      <w:r>
-        <w:rPr>
-          <w:rFonts w:ascii="Times New Roman" w:hAnsi="Times New Roman" w:eastAsia="Times New Roman" w:cs="Times New Roman"/>
-          <w:sz w:val="24"/>
-          <w:szCs w:val="24"/>
-        </w:rPr>
-        <w:tab/>
-        <w:t>CS2021-01</w:t>
-      </w:r>
-      <w:r>
-        <w:rPr>
-          <w:rFonts w:ascii="Times New Roman" w:hAnsi="Times New Roman" w:eastAsia="Times New Roman" w:cs="Times New Roman"/>
-          <w:sz w:val="24"/>
-          <w:szCs w:val="24"/>
-        </w:rPr>
-        <w:tab/>
-        <w:t>21045</w:t>
-      </w:r>
-    </w:p>
-    <w:p>
-      <w:pPr>
-        <w:tabs>
-          <w:tab w:val="left" w:pos="2160"/>
-          <w:tab w:val="left" w:pos="5040"/>
-        </w:tabs>
-        <w:spacing w:line="360" w:lineRule="auto" w:before="0" w:after="0"/>
-        <w:ind w:left="0" w:firstLine="720"/>
-        <w:jc w:val="both"/>
-      </w:pPr>
-      <w:r>
-        <w:rPr>
-          <w:rFonts w:ascii="Times New Roman" w:hAnsi="Times New Roman" w:eastAsia="Times New Roman" w:cs="Times New Roman"/>
-          <w:sz w:val="24"/>
-          <w:szCs w:val="24"/>
-        </w:rPr>
-        <w:t>Sumayya Khan</w:t>
-      </w:r>
-      <w:r>
-        <w:rPr>
-          <w:rFonts w:ascii="Times New Roman" w:hAnsi="Times New Roman" w:eastAsia="Times New Roman" w:cs="Times New Roman"/>
-          <w:sz w:val="24"/>
-          <w:szCs w:val="24"/>
-        </w:rPr>
-        <w:tab/>
-        <w:t>CS2021-02</w:t>
-      </w:r>
-      <w:r>
-        <w:rPr>
-          <w:rFonts w:ascii="Times New Roman" w:hAnsi="Times New Roman" w:eastAsia="Times New Roman" w:cs="Times New Roman"/>
-          <w:sz w:val="24"/>
-          <w:szCs w:val="24"/>
-        </w:rPr>
-        <w:tab/>
-        <w:t>21052</w:t>
-      </w:r>
-    </w:p>
-    <w:p>
-      <w:pPr>
-        <w:tabs>
-          <w:tab w:val="left" w:pos="2160"/>
-          <w:tab w:val="left" w:pos="5040"/>
-        </w:tabs>
-        <w:spacing w:line="360" w:lineRule="auto" w:before="0" w:after="0"/>
-        <w:ind w:left="0" w:firstLine="720"/>
-        <w:jc w:val="both"/>
-      </w:pPr>
-      <w:r>
-        <w:rPr>
-          <w:rFonts w:ascii="Times New Roman" w:hAnsi="Times New Roman" w:eastAsia="Times New Roman" w:cs="Times New Roman"/>
-          <w:sz w:val="24"/>
-          <w:szCs w:val="24"/>
-        </w:rPr>
-        <w:t>Habiba Ali</w:t>
-      </w:r>
-      <w:r>
-        <w:rPr>
-          <w:rFonts w:ascii="Times New Roman" w:hAnsi="Times New Roman" w:eastAsia="Times New Roman" w:cs="Times New Roman"/>
-          <w:sz w:val="24"/>
-          <w:szCs w:val="24"/>
-        </w:rPr>
-        <w:tab/>
-        <w:t>CS2021-03</w:t>
-      </w:r>
-      <w:r>
-        <w:rPr>
-          <w:rFonts w:ascii="Times New Roman" w:hAnsi="Times New Roman" w:eastAsia="Times New Roman" w:cs="Times New Roman"/>
-          <w:sz w:val="24"/>
-          <w:szCs w:val="24"/>
-        </w:rPr>
-        <w:tab/>
-        <w:t>21060</w:t>
       </w:r>
     </w:p>
     <w:p>
@@ -548,24 +357,160 @@
         <w:jc w:val="left"/>
       </w:pPr>
       <w:r>
+        <w:rPr>
+          <w:b/>
+          <w:sz w:val="26"/>
+        </w:rPr>
+        <w:t>Name</w:t>
+      </w:r>
+      <w:r>
         <w:tab/>
       </w:r>
       <w:r>
+        <w:rPr>
+          <w:b/>
+          <w:sz w:val="26"/>
+        </w:rPr>
+        <w:t>Enrolment</w:t>
+      </w:r>
+      <w:r>
         <w:tab/>
       </w:r>
-    </w:p>
-    <w:p>
-      <w:pPr>
-        <w:spacing w:line="360" w:lineRule="auto" w:before="0" w:after="0"/>
-        <w:ind w:left="0" w:firstLine="720"/>
-        <w:jc w:val="both"/>
-      </w:pPr>
-      <w:r>
-        <w:rPr>
-          <w:rFonts w:ascii="Times New Roman" w:hAnsi="Times New Roman" w:eastAsia="Times New Roman" w:cs="Times New Roman"/>
+      <w:r>
+        <w:rPr>
           <w:b/>
-          <w:sz w:val="24"/>
-          <w:szCs w:val="24"/>
+          <w:sz w:val="26"/>
+        </w:rPr>
+        <w:t>Seat number</w:t>
+      </w:r>
+    </w:p>
+    <w:p>
+      <w:pPr>
+        <w:tabs>
+          <w:tab w:val="left" w:pos="2160"/>
+          <w:tab w:val="left" w:pos="5040"/>
+        </w:tabs>
+        <w:spacing w:after="40" w:line="240" w:lineRule="auto"/>
+        <w:jc w:val="left"/>
+      </w:pPr>
+      <w:r>
+        <w:rPr>
+          <w:sz w:val="26"/>
+        </w:rPr>
+        <w:t>Muskan Fatima</w:t>
+      </w:r>
+      <w:r>
+        <w:tab/>
+      </w:r>
+      <w:r>
+        <w:rPr>
+          <w:sz w:val="26"/>
+        </w:rPr>
+        <w:t>CS2021-01</w:t>
+      </w:r>
+      <w:r>
+        <w:tab/>
+      </w:r>
+      <w:r>
+        <w:rPr>
+          <w:sz w:val="26"/>
+        </w:rPr>
+        <w:t>21045</w:t>
+      </w:r>
+    </w:p>
+    <w:p>
+      <w:pPr>
+        <w:tabs>
+          <w:tab w:val="left" w:pos="2160"/>
+          <w:tab w:val="left" w:pos="5040"/>
+        </w:tabs>
+        <w:spacing w:after="40" w:line="240" w:lineRule="auto"/>
+        <w:jc w:val="left"/>
+      </w:pPr>
+      <w:r>
+        <w:rPr>
+          <w:sz w:val="26"/>
+        </w:rPr>
+        <w:t>Sumayya Khan</w:t>
+      </w:r>
+      <w:r>
+        <w:tab/>
+      </w:r>
+      <w:r>
+        <w:rPr>
+          <w:sz w:val="26"/>
+        </w:rPr>
+        <w:t>CS2021-02</w:t>
+      </w:r>
+      <w:r>
+        <w:tab/>
+      </w:r>
+      <w:r>
+        <w:rPr>
+          <w:sz w:val="26"/>
+        </w:rPr>
+        <w:t>21052</w:t>
+      </w:r>
+    </w:p>
+    <w:p>
+      <w:pPr>
+        <w:tabs>
+          <w:tab w:val="left" w:pos="2160"/>
+          <w:tab w:val="left" w:pos="5040"/>
+        </w:tabs>
+        <w:spacing w:after="40" w:line="240" w:lineRule="auto"/>
+        <w:jc w:val="left"/>
+      </w:pPr>
+      <w:r>
+        <w:rPr>
+          <w:sz w:val="26"/>
+        </w:rPr>
+        <w:t>Habiba Ali</w:t>
+      </w:r>
+      <w:r>
+        <w:tab/>
+      </w:r>
+      <w:r>
+        <w:rPr>
+          <w:sz w:val="26"/>
+        </w:rPr>
+        <w:t>CS2021-03</w:t>
+      </w:r>
+      <w:r>
+        <w:tab/>
+      </w:r>
+      <w:r>
+        <w:rPr>
+          <w:sz w:val="26"/>
+        </w:rPr>
+        <w:t>21060</w:t>
+      </w:r>
+    </w:p>
+    <w:p>
+      <w:pPr>
+        <w:tabs>
+          <w:tab w:val="left" w:pos="2160"/>
+          <w:tab w:val="left" w:pos="5040"/>
+        </w:tabs>
+        <w:spacing w:after="40" w:line="240" w:lineRule="auto"/>
+        <w:jc w:val="left"/>
+      </w:pPr>
+      <w:r>
+        <w:tab/>
+      </w:r>
+      <w:r>
+        <w:tab/>
+      </w:r>
+    </w:p>
+    <w:p>
+      <w:pPr>
+        <w:spacing w:before="360" w:line="240" w:lineRule="auto"/>
+        <w:jc w:val="left"/>
+      </w:pPr>
+      <w:r>
+        <w:rPr>
+          <w:b/>
+          <w:sz w:val="26"/>
         </w:rPr>
         <w:t>Project Advisor: Miss Hira Tariq</w:t>
       </w:r>
@@ -641,8 +586,7 @@
     </w:p>
     <w:tbl>
       <w:tblPr>
-        <w:tblW w:w="9547" w:type="dxa"/>
-        <w:jc w:val="center"/>
+        <w:tblW w:w="9590" w:type="dxa"/>
         <w:tblInd w:w="-950" w:type="dxa"/>
         <w:tblBorders>
           <w:top w:val="nil"/>
@@ -653,16 +597,20 @@
           <w:insideV w:val="nil"/>
         </w:tblBorders>
         <w:tblLayout w:type="fixed"/>
+        <w:tblCellMar>
+          <w:left w:w="0" w:type="dxa"/>
+          <w:right w:w="0" w:type="dxa"/>
+        </w:tblCellMar>
         <w:tblLook w:val="04A0" w:firstRow="1" w:lastRow="0" w:firstColumn="1" w:lastColumn="0" w:noHBand="0" w:noVBand="1"/>
       </w:tblPr>
       <w:tblGrid>
-        <w:gridCol w:w="1267"/>
-        <w:gridCol w:w="8280"/>
+        <w:gridCol w:w="1282"/>
+        <w:gridCol w:w="8308"/>
       </w:tblGrid>
       <w:tr>
         <w:tc>
           <w:tcPr>
-            <w:tcW w:w="1267" w:type="dxa"/>
+            <w:tcW w:w="1282" w:type="dxa"/>
           </w:tcPr>
           <w:p>
             <w:pPr>
@@ -673,7 +621,7 @@
                 <w:noProof/>
               </w:rPr>
               <w:drawing>
-                <wp:inline distT="0" distB="0" distL="0" distR="0" wp14:anchorId="375C81F3" wp14:editId="72F219C5">
+                <wp:inline distT="0" distB="0" distL="0" distR="0" wp14:anchorId="6C4BC0C3" wp14:editId="312EE81C">
                   <wp:extent cx="813816" cy="877824"/>
                   <wp:effectExtent l="0" t="0" r="0" b="0"/>
                   <wp:docPr id="2" name="Picture 2"/>
@@ -684,7 +632,7 @@
                     <a:graphicData uri="http://schemas.openxmlformats.org/drawingml/2006/picture">
                       <pic:pic xmlns:pic="http://schemas.openxmlformats.org/drawingml/2006/picture">
                         <pic:nvPicPr>
-                          <pic:cNvPr id="0" name="tmprqd1bkr8.png"/>
+                          <pic:cNvPr id="0" name="tmpiqaikwif.png"/>
                           <pic:cNvPicPr/>
                         </pic:nvPicPr>
                         <pic:blipFill>
@@ -712,7 +660,7 @@
         </w:tc>
         <w:tc>
           <w:tcPr>
-            <w:tcW w:w="8280" w:type="dxa"/>
+            <w:tcW w:w="8309" w:type="dxa"/>
             <w:noWrap/>
           </w:tcPr>
           <w:p>
@@ -788,146 +736,19 @@
           <w:tab w:val="left" w:pos="2074"/>
           <w:tab w:val="left" w:pos="5040"/>
         </w:tabs>
-        <w:spacing w:line="360" w:lineRule="auto" w:before="0" w:after="0"/>
-        <w:ind w:left="0" w:firstLine="720"/>
-        <w:jc w:val="both"/>
-      </w:pPr>
-      <w:r>
-        <w:rPr>
-          <w:rFonts w:ascii="Times New Roman" w:hAnsi="Times New Roman" w:eastAsia="Times New Roman" w:cs="Times New Roman"/>
-          <w:sz w:val="24"/>
-          <w:szCs w:val="24"/>
-        </w:rPr>
+        <w:spacing w:after="40" w:line="240" w:lineRule="auto"/>
+        <w:jc w:val="left"/>
+      </w:pPr>
+      <w:r>
         <w:t>Name</w:t>
       </w:r>
       <w:r>
-        <w:rPr>
-          <w:rFonts w:ascii="Times New Roman" w:hAnsi="Times New Roman" w:eastAsia="Times New Roman" w:cs="Times New Roman"/>
-          <w:sz w:val="24"/>
-          <w:szCs w:val="24"/>
-        </w:rPr>
         <w:tab/>
         <w:t>Enrolment</w:t>
       </w:r>
       <w:r>
-        <w:rPr>
-          <w:rFonts w:ascii="Times New Roman" w:hAnsi="Times New Roman" w:eastAsia="Times New Roman" w:cs="Times New Roman"/>
-          <w:sz w:val="24"/>
-          <w:szCs w:val="24"/>
-        </w:rPr>
         <w:tab/>
         <w:t>Seat</w:t>
-      </w:r>
-    </w:p>
-    <w:p>
-      <w:pPr>
-        <w:tabs>
-          <w:tab w:val="left" w:pos="2074"/>
-          <w:tab w:val="left" w:pos="5040"/>
-        </w:tabs>
-        <w:spacing w:line="360" w:lineRule="auto" w:before="0" w:after="0"/>
-        <w:ind w:left="0" w:firstLine="720"/>
-        <w:jc w:val="both"/>
-      </w:pPr>
-      <w:r>
-        <w:rPr>
-          <w:rFonts w:ascii="Times New Roman" w:hAnsi="Times New Roman" w:eastAsia="Times New Roman" w:cs="Times New Roman"/>
-          <w:sz w:val="24"/>
-          <w:szCs w:val="24"/>
-        </w:rPr>
-        <w:t>Muskan Fatima</w:t>
-      </w:r>
-      <w:r>
-        <w:rPr>
-          <w:rFonts w:ascii="Times New Roman" w:hAnsi="Times New Roman" w:eastAsia="Times New Roman" w:cs="Times New Roman"/>
-          <w:sz w:val="24"/>
-          <w:szCs w:val="24"/>
-        </w:rPr>
-        <w:tab/>
-        <w:t>CS2021-01</w:t>
-      </w:r>
-      <w:r>
-        <w:rPr>
-          <w:rFonts w:ascii="Times New Roman" w:hAnsi="Times New Roman" w:eastAsia="Times New Roman" w:cs="Times New Roman"/>
-          <w:sz w:val="24"/>
-          <w:szCs w:val="24"/>
-        </w:rPr>
-        <w:tab/>
-        <w:t>21045</w:t>
-      </w:r>
-    </w:p>
-    <w:p>
-      <w:pPr>
-        <w:tabs>
-          <w:tab w:val="left" w:pos="2074"/>
-          <w:tab w:val="left" w:pos="5040"/>
-        </w:tabs>
-        <w:spacing w:line="360" w:lineRule="auto" w:before="0" w:after="0"/>
-        <w:ind w:left="0" w:firstLine="720"/>
-        <w:jc w:val="both"/>
-      </w:pPr>
-      <w:r>
-        <w:rPr>
-          <w:rFonts w:ascii="Times New Roman" w:hAnsi="Times New Roman" w:eastAsia="Times New Roman" w:cs="Times New Roman"/>
-          <w:sz w:val="24"/>
-          <w:szCs w:val="24"/>
-        </w:rPr>
-        <w:t>Sumayya Khan</w:t>
-      </w:r>
-      <w:r>
-        <w:rPr>
-          <w:rFonts w:ascii="Times New Roman" w:hAnsi="Times New Roman" w:eastAsia="Times New Roman" w:cs="Times New Roman"/>
-          <w:sz w:val="24"/>
-          <w:szCs w:val="24"/>
-        </w:rPr>
-        <w:tab/>
-        <w:t>CS2021-02</w:t>
-      </w:r>
-      <w:r>
-        <w:rPr>
-          <w:rFonts w:ascii="Times New Roman" w:hAnsi="Times New Roman" w:eastAsia="Times New Roman" w:cs="Times New Roman"/>
-          <w:sz w:val="24"/>
-          <w:szCs w:val="24"/>
-        </w:rPr>
-        <w:tab/>
-        <w:t>21052</w:t>
-      </w:r>
-    </w:p>
-    <w:p>
-      <w:pPr>
-        <w:tabs>
-          <w:tab w:val="left" w:pos="2074"/>
-          <w:tab w:val="left" w:pos="5040"/>
-        </w:tabs>
-        <w:spacing w:line="360" w:lineRule="auto" w:before="0" w:after="0"/>
-        <w:ind w:left="0" w:firstLine="720"/>
-        <w:jc w:val="both"/>
-      </w:pPr>
-      <w:r>
-        <w:rPr>
-          <w:rFonts w:ascii="Times New Roman" w:hAnsi="Times New Roman" w:eastAsia="Times New Roman" w:cs="Times New Roman"/>
-          <w:sz w:val="24"/>
-          <w:szCs w:val="24"/>
-        </w:rPr>
-        <w:t>Habiba Ali</w:t>
-      </w:r>
-      <w:r>
-        <w:rPr>
-          <w:rFonts w:ascii="Times New Roman" w:hAnsi="Times New Roman" w:eastAsia="Times New Roman" w:cs="Times New Roman"/>
-          <w:sz w:val="24"/>
-          <w:szCs w:val="24"/>
-        </w:rPr>
-        <w:tab/>
-        <w:t>CS2021-03</w:t>
-      </w:r>
-      <w:r>
-        <w:rPr>
-          <w:rFonts w:ascii="Times New Roman" w:hAnsi="Times New Roman" w:eastAsia="Times New Roman" w:cs="Times New Roman"/>
-          <w:sz w:val="24"/>
-          <w:szCs w:val="24"/>
-        </w:rPr>
-        <w:tab/>
-        <w:t>21060</w:t>
       </w:r>
     </w:p>
     <w:p>
@@ -940,6 +761,69 @@
         <w:jc w:val="left"/>
       </w:pPr>
       <w:r>
+        <w:t>Muskan Fatima</w:t>
+      </w:r>
+      <w:r>
+        <w:tab/>
+        <w:t>CS2021-01</w:t>
+      </w:r>
+      <w:r>
+        <w:tab/>
+        <w:t>21045</w:t>
+      </w:r>
+    </w:p>
+    <w:p>
+      <w:pPr>
+        <w:tabs>
+          <w:tab w:val="left" w:pos="2074"/>
+          <w:tab w:val="left" w:pos="5040"/>
+        </w:tabs>
+        <w:spacing w:after="40" w:line="240" w:lineRule="auto"/>
+        <w:jc w:val="left"/>
+      </w:pPr>
+      <w:r>
+        <w:t>Sumayya Khan</w:t>
+      </w:r>
+      <w:r>
+        <w:tab/>
+        <w:t>CS2021-02</w:t>
+      </w:r>
+      <w:r>
+        <w:tab/>
+        <w:t>21052</w:t>
+      </w:r>
+    </w:p>
+    <w:p>
+      <w:pPr>
+        <w:tabs>
+          <w:tab w:val="left" w:pos="2074"/>
+          <w:tab w:val="left" w:pos="5040"/>
+        </w:tabs>
+        <w:spacing w:after="40" w:line="240" w:lineRule="auto"/>
+        <w:jc w:val="left"/>
+      </w:pPr>
+      <w:r>
+        <w:t>Habiba Ali</w:t>
+      </w:r>
+      <w:r>
+        <w:tab/>
+        <w:t>CS2021-03</w:t>
+      </w:r>
+      <w:r>
+        <w:tab/>
+        <w:t>21060</w:t>
+      </w:r>
+    </w:p>
+    <w:p>
+      <w:pPr>
+        <w:tabs>
+          <w:tab w:val="left" w:pos="2074"/>
+          <w:tab w:val="left" w:pos="5040"/>
+        </w:tabs>
+        <w:spacing w:after="40" w:line="240" w:lineRule="auto"/>
+        <w:jc w:val="left"/>
+      </w:pPr>
+      <w:r>
         <w:tab/>
       </w:r>
       <w:r>
@@ -956,8 +840,7 @@
     </w:p>
     <w:tbl>
       <w:tblPr>
-        <w:tblW w:w="10080" w:type="dxa"/>
-        <w:jc w:val="center"/>
+        <w:tblW w:w="8640" w:type="dxa"/>
         <w:tblBorders>
           <w:top w:val="nil"/>
           <w:left w:val="nil"/>
@@ -971,7 +854,7 @@
       </w:tblPr>
       <w:tblGrid>
         <w:gridCol w:w="5040"/>
-        <w:gridCol w:w="5040"/>
+        <w:gridCol w:w="3600"/>
       </w:tblGrid>
       <w:tr>
         <w:tc>
@@ -989,7 +872,7 @@
         </w:tc>
         <w:tc>
           <w:tcPr>
-            <w:tcW w:w="5040" w:type="dxa"/>
+            <w:tcW w:w="3600" w:type="dxa"/>
           </w:tcPr>
           <w:p>
             <w:pPr>
@@ -1017,7 +900,7 @@
         </w:tc>
         <w:tc>
           <w:tcPr>
-            <w:tcW w:w="5040" w:type="dxa"/>
+            <w:tcW w:w="3600" w:type="dxa"/>
           </w:tcPr>
           <w:p>
             <w:pPr>
@@ -1045,7 +928,7 @@
         </w:tc>
         <w:tc>
           <w:tcPr>
-            <w:tcW w:w="5040" w:type="dxa"/>
+            <w:tcW w:w="3600" w:type="dxa"/>
           </w:tcPr>
           <w:p>
             <w:pPr>
@@ -1070,7 +953,7 @@
         </w:tc>
         <w:tc>
           <w:tcPr>
-            <w:tcW w:w="5040" w:type="dxa"/>
+            <w:tcW w:w="3600" w:type="dxa"/>
           </w:tcPr>
           <w:p>
             <w:pPr>
@@ -1098,7 +981,7 @@
         </w:tc>
         <w:tc>
           <w:tcPr>
-            <w:tcW w:w="5040" w:type="dxa"/>
+            <w:tcW w:w="3600" w:type="dxa"/>
           </w:tcPr>
           <w:p>
             <w:pPr>
@@ -1239,7 +1122,7 @@
         </w:rPr>
         <w:fldChar w:fldCharType="separate"/>
       </w:r>
-      <w:hyperlink w:anchor="_Toc241175323" w:history="1">
+      <w:hyperlink w:anchor="_Toc241175786" w:history="1">
         <w:r>
           <w:rPr>
             <w:rFonts w:ascii="Times New Roman" w:hAnsi="Times New Roman" w:eastAsia="Times New Roman" w:cs="Times New Roman"/>
@@ -1278,7 +1161,7 @@
             <w:sz w:val="20"/>
             <w:szCs w:val="20"/>
           </w:rPr>
-          <w:instrText xml:space="preserve"> PAGEREF _Toc241175323 \h </w:instrText>
+          <w:instrText xml:space="preserve"> PAGEREF _Toc241175786 \h </w:instrText>
         </w:r>
         <w:r>
           <w:rPr>
@@ -1335,7 +1218,7 @@
           <w:sz w:val="24"/>
         </w:rPr>
       </w:pPr>
-      <w:hyperlink w:anchor="_Toc241175324" w:history="1">
+      <w:hyperlink w:anchor="_Toc241175787" w:history="1">
         <w:r>
           <w:rPr>
             <w:rFonts w:ascii="Times New Roman" w:hAnsi="Times New Roman" w:eastAsia="Times New Roman" w:cs="Times New Roman"/>
@@ -1374,7 +1257,7 @@
             <w:sz w:val="20"/>
             <w:szCs w:val="20"/>
           </w:rPr>
-          <w:instrText xml:space="preserve"> PAGEREF _Toc241175324 \h </w:instrText>
+          <w:instrText xml:space="preserve"> PAGEREF _Toc241175787 \h </w:instrText>
         </w:r>
         <w:r>
           <w:rPr>
@@ -1432,7 +1315,7 @@
           <w:sz w:val="24"/>
         </w:rPr>
       </w:pPr>
-      <w:hyperlink w:anchor="_Toc241175325" w:history="1">
+      <w:hyperlink w:anchor="_Toc241175788" w:history="1">
         <w:r>
           <w:rPr>
             <w:rFonts w:ascii="Times New Roman" w:hAnsi="Times New Roman" w:eastAsia="Times New Roman" w:cs="Times New Roman"/>
@@ -1491,7 +1374,7 @@
             <w:sz w:val="20"/>
             <w:szCs w:val="20"/>
           </w:rPr>
-          <w:instrText xml:space="preserve"> PAGEREF _Toc241175325 \h </w:instrText>
+          <w:instrText xml:space="preserve"> PAGEREF _Toc241175788 \h </w:instrText>
         </w:r>
         <w:r>
           <w:rPr>
@@ -1736,7 +1619,7 @@
         </w:pBdr>
         <w:spacing w:after="240"/>
       </w:pPr>
-      <w:bookmarkStart w:id="0" w:name="_Toc241175323"/>
+      <w:bookmarkStart w:id="0" w:name="_Toc241175786"/>
       <w:r>
         <w:rPr>
           <w:rFonts w:ascii="Times New Roman" w:eastAsia="Times New Roman" w:hAnsi="Times New Roman" w:cs="Times New Roman"/>
@@ -1753,7 +1636,7 @@
       <w:pPr>
         <w:pStyle w:val="Heading1"/>
       </w:pPr>
-      <w:bookmarkStart w:id="1" w:name="_Toc241175324"/>
+      <w:bookmarkStart w:id="1" w:name="_Toc241175787"/>
       <w:r>
         <w:rPr>
           <w:rFonts w:ascii="Times New Roman" w:eastAsia="Times New Roman" w:hAnsi="Times New Roman" w:cs="Times New Roman"/>
@@ -1790,7 +1673,7 @@
         </w:numPr>
         <w:spacing w:before="360" w:after="120"/>
       </w:pPr>
-      <w:bookmarkStart w:id="2" w:name="_Toc241175325"/>
+      <w:bookmarkStart w:id="2" w:name="_Toc241175788"/>
       <w:r>
         <w:rPr>
           <w:rFonts w:ascii="Times New Roman" w:eastAsia="Times New Roman" w:hAnsi="Times New Roman" w:cs="Times New Roman"/>
@@ -1958,181 +1841,9 @@
 <file path=word/numbering.xml><?xml version="1.0" encoding="utf-8"?>
 <w:numbering xmlns:wpc="http://schemas.microsoft.com/office/word/2010/wordprocessingCanvas" xmlns:cx="http://schemas.microsoft.com/office/drawing/2014/chartex" xmlns:cx1="http://schemas.microsoft.com/office/drawing/2015/9/8/chartex" xmlns:cx2="http://schemas.microsoft.com/office/drawing/2015/10/21/chartex" xmlns:cx3="http://schemas.microsoft.com/office/drawing/2016/5/9/chartex" xmlns:cx4="http://schemas.microsoft.com/office/drawing/2016/5/10/chartex" xmlns:cx5="http://schemas.microsoft.com/office/drawing/2016/5/11/chartex" xmlns:cx6="http://schemas.microsoft.com/office/drawing/2016/5/12/chartex" xmlns:cx7="http://schemas.microsoft.com/office/drawing/2016/5/13/chartex" xmlns:cx8="http://schemas.microsoft.com/office/drawing/2016/5/14/chartex" xmlns:mc="http://schemas.openxmlformats.org/markup-compatibility/2006" xmlns:aink="http://schemas.microsoft.com/office/drawing/2016/ink" xmlns:am3d="http://schemas.microsoft.com/office/drawing/2017/model3d" xmlns:o="urn:schemas-microsoft-com:office:office" xmlns:oel="http://schemas.microsoft.com/office/2019/extlst" xmlns:r="http://schemas.openxmlformats.org/officeDocument/2006/relationships" xmlns:m="http://schemas.openxmlformats.org/officeDocument/2006/math" xmlns:v="urn:schemas-microsoft-com:vml" xmlns:wp14="http://schemas.microsoft.com/office/word/2010/wordprocessingDrawing" xmlns:wp="http://schemas.openxmlformats.org/drawingml/2006/wordprocessingDrawing" xmlns:w10="urn:schemas-microsoft-com:office:word" xmlns:w="http://schemas.openxmlformats.org/wordprocessingml/2006/main" xmlns:w14="http://schemas.microsoft.com/office/word/2010/wordml" xmlns:w15="http://schemas.microsoft.com/office/word/2012/wordml" xmlns:w16cex="http://schemas.microsoft.com/office/word/2018/wordml/cex" xmlns:w16cid="http://schemas.microsoft.com/office/word/2016/wordml/cid" xmlns:w16="http://schemas.microsoft.com/office/word/2018/wordml" xmlns:w16du="http://schemas.microsoft.com/office/word/2023/wordml/word16du" xmlns:w16sdtdh="http://schemas.microsoft.com/office/word/2020/wordml/sdtdatahash" xmlns:w16sdtfl="http://schemas.microsoft.com/office/word/2024/wordml/sdtformatlock" xmlns:w16se="http://schemas.microsoft.com/office/word/2015/wordml/symex" xmlns:wpg="http://schemas.microsoft.com/office/word/2010/wordprocessingGroup" xmlns:wpi="http://schemas.microsoft.com/office/word/2010/wordprocessingInk" xmlns:wne="http://schemas.microsoft.com/office/word/2006/wordml" xmlns:wps="http://schemas.microsoft.com/office/word/2010/wordprocessingShape" mc:Ignorable="w14 w15 w16se w16cid w16 w16cex w16sdtdh w16sdtfl w16du wp14">
   <w:abstractNum w:abstractNumId="0" w15:restartNumberingAfterBreak="0">
-    <w:nsid w:val="143B4FB5"/>
+    <w:nsid w:val="07A337C9"/>
     <w:multiLevelType w:val="multilevel"/>
-    <w:tmpl w:val="0409001F"/>
-    <w:lvl w:ilvl="0">
-      <w:start w:val="1"/>
-      <w:numFmt w:val="decimal"/>
-      <w:lvlText w:val="%1."/>
-      <w:lvlJc w:val="left"/>
-      <w:pPr>
-        <w:ind w:left="360" w:hanging="360"/>
-      </w:pPr>
-    </w:lvl>
-    <w:lvl w:ilvl="1">
-      <w:start w:val="1"/>
-      <w:numFmt w:val="decimal"/>
-      <w:lvlText w:val="%1.%2."/>
-      <w:lvlJc w:val="left"/>
-      <w:pPr>
-        <w:ind w:left="792" w:hanging="432"/>
-      </w:pPr>
-    </w:lvl>
-    <w:lvl w:ilvl="2">
-      <w:start w:val="1"/>
-      <w:numFmt w:val="decimal"/>
-      <w:lvlText w:val="%1.%2.%3."/>
-      <w:lvlJc w:val="left"/>
-      <w:pPr>
-        <w:ind w:left="1224" w:hanging="504"/>
-      </w:pPr>
-    </w:lvl>
-    <w:lvl w:ilvl="3">
-      <w:start w:val="1"/>
-      <w:numFmt w:val="decimal"/>
-      <w:lvlText w:val="%1.%2.%3.%4."/>
-      <w:lvlJc w:val="left"/>
-      <w:pPr>
-        <w:ind w:left="1728" w:hanging="648"/>
-      </w:pPr>
-    </w:lvl>
-    <w:lvl w:ilvl="4">
-      <w:start w:val="1"/>
-      <w:numFmt w:val="decimal"/>
-      <w:lvlText w:val="%1.%2.%3.%4.%5."/>
-      <w:lvlJc w:val="left"/>
-      <w:pPr>
-        <w:ind w:left="2232" w:hanging="792"/>
-      </w:pPr>
-    </w:lvl>
-    <w:lvl w:ilvl="5">
-      <w:start w:val="1"/>
-      <w:numFmt w:val="decimal"/>
-      <w:lvlText w:val="%1.%2.%3.%4.%5.%6."/>
-      <w:lvlJc w:val="left"/>
-      <w:pPr>
-        <w:ind w:left="2736" w:hanging="936"/>
-      </w:pPr>
-    </w:lvl>
-    <w:lvl w:ilvl="6">
-      <w:start w:val="1"/>
-      <w:numFmt w:val="decimal"/>
-      <w:lvlText w:val="%1.%2.%3.%4.%5.%6.%7."/>
-      <w:lvlJc w:val="left"/>
-      <w:pPr>
-        <w:ind w:left="3240" w:hanging="1080"/>
-      </w:pPr>
-    </w:lvl>
-    <w:lvl w:ilvl="7">
-      <w:start w:val="1"/>
-      <w:numFmt w:val="decimal"/>
-      <w:lvlText w:val="%1.%2.%3.%4.%5.%6.%7.%8."/>
-      <w:lvlJc w:val="left"/>
-      <w:pPr>
-        <w:ind w:left="3744" w:hanging="1224"/>
-      </w:pPr>
-    </w:lvl>
-    <w:lvl w:ilvl="8">
-      <w:start w:val="1"/>
-      <w:numFmt w:val="decimal"/>
-      <w:lvlText w:val="%1.%2.%3.%4.%5.%6.%7.%8.%9."/>
-      <w:lvlJc w:val="left"/>
-      <w:pPr>
-        <w:ind w:left="4320" w:hanging="1440"/>
-      </w:pPr>
-    </w:lvl>
-  </w:abstractNum>
-  <w:abstractNum w:abstractNumId="1" w15:restartNumberingAfterBreak="0">
-    <w:nsid w:val="46F6053F"/>
-    <w:multiLevelType w:val="multilevel"/>
-    <w:tmpl w:val="04090025"/>
-    <w:lvl w:ilvl="0">
-      <w:start w:val="1"/>
-      <w:numFmt w:val="decimal"/>
-      <w:lvlText w:val="%1"/>
-      <w:lvlJc w:val="left"/>
-      <w:pPr>
-        <w:ind w:left="432" w:hanging="432"/>
-      </w:pPr>
-    </w:lvl>
-    <w:lvl w:ilvl="1">
-      <w:start w:val="1"/>
-      <w:numFmt w:val="decimal"/>
-      <w:lvlText w:val="%1.%2"/>
-      <w:lvlJc w:val="left"/>
-      <w:pPr>
-        <w:ind w:left="576" w:hanging="576"/>
-      </w:pPr>
-    </w:lvl>
-    <w:lvl w:ilvl="2">
-      <w:start w:val="1"/>
-      <w:numFmt w:val="decimal"/>
-      <w:lvlText w:val="%1.%2.%3"/>
-      <w:lvlJc w:val="left"/>
-      <w:pPr>
-        <w:ind w:left="720" w:hanging="720"/>
-      </w:pPr>
-    </w:lvl>
-    <w:lvl w:ilvl="3">
-      <w:start w:val="1"/>
-      <w:numFmt w:val="decimal"/>
-      <w:lvlText w:val="%1.%2.%3.%4"/>
-      <w:lvlJc w:val="left"/>
-      <w:pPr>
-        <w:ind w:left="864" w:hanging="864"/>
-      </w:pPr>
-    </w:lvl>
-    <w:lvl w:ilvl="4">
-      <w:start w:val="1"/>
-      <w:numFmt w:val="decimal"/>
-      <w:lvlText w:val="%1.%2.%3.%4.%5"/>
-      <w:lvlJc w:val="left"/>
-      <w:pPr>
-        <w:ind w:left="1008" w:hanging="1008"/>
-      </w:pPr>
-    </w:lvl>
-    <w:lvl w:ilvl="5">
-      <w:start w:val="1"/>
-      <w:numFmt w:val="decimal"/>
-      <w:lvlText w:val="%1.%2.%3.%4.%5.%6"/>
-      <w:lvlJc w:val="left"/>
-      <w:pPr>
-        <w:ind w:left="1152" w:hanging="1152"/>
-      </w:pPr>
-    </w:lvl>
-    <w:lvl w:ilvl="6">
-      <w:start w:val="1"/>
-      <w:numFmt w:val="decimal"/>
-      <w:lvlText w:val="%1.%2.%3.%4.%5.%6.%7"/>
-      <w:lvlJc w:val="left"/>
-      <w:pPr>
-        <w:ind w:left="1296" w:hanging="1296"/>
-      </w:pPr>
-    </w:lvl>
-    <w:lvl w:ilvl="7">
-      <w:start w:val="1"/>
-      <w:numFmt w:val="decimal"/>
-      <w:lvlText w:val="%1.%2.%3.%4.%5.%6.%7.%8"/>
-      <w:lvlJc w:val="left"/>
-      <w:pPr>
-        <w:ind w:left="1440" w:hanging="1440"/>
-      </w:pPr>
-    </w:lvl>
-    <w:lvl w:ilvl="8">
-      <w:start w:val="1"/>
-      <w:numFmt w:val="decimal"/>
-      <w:lvlText w:val="%1.%2.%3.%4.%5.%6.%7.%8.%9"/>
-      <w:lvlJc w:val="left"/>
-      <w:pPr>
-        <w:ind w:left="1584" w:hanging="1584"/>
-      </w:pPr>
-    </w:lvl>
-  </w:abstractNum>
-  <w:abstractNum w:abstractNumId="2" w15:restartNumberingAfterBreak="0">
-    <w:nsid w:val="697A29CF"/>
-    <w:multiLevelType w:val="multilevel"/>
-    <w:tmpl w:val="356243B8"/>
+    <w:tmpl w:val="D6C2508C"/>
     <w:lvl w:ilvl="0">
       <w:start w:val="1"/>
       <w:numFmt w:val="decimal"/>
@@ -2208,8 +1919,180 @@
       <w:lvlJc w:val="left"/>
     </w:lvl>
   </w:abstractNum>
-  <w:num w:numId="1" w16cid:durableId="181362482">
-    <w:abstractNumId w:val="2"/>
+  <w:abstractNum w:abstractNumId="1" w15:restartNumberingAfterBreak="0">
+    <w:nsid w:val="143B4FB5"/>
+    <w:multiLevelType w:val="multilevel"/>
+    <w:tmpl w:val="0409001F"/>
+    <w:lvl w:ilvl="0">
+      <w:start w:val="1"/>
+      <w:numFmt w:val="decimal"/>
+      <w:lvlText w:val="%1."/>
+      <w:lvlJc w:val="left"/>
+      <w:pPr>
+        <w:ind w:left="360" w:hanging="360"/>
+      </w:pPr>
+    </w:lvl>
+    <w:lvl w:ilvl="1">
+      <w:start w:val="1"/>
+      <w:numFmt w:val="decimal"/>
+      <w:lvlText w:val="%1.%2."/>
+      <w:lvlJc w:val="left"/>
+      <w:pPr>
+        <w:ind w:left="792" w:hanging="432"/>
+      </w:pPr>
+    </w:lvl>
+    <w:lvl w:ilvl="2">
+      <w:start w:val="1"/>
+      <w:numFmt w:val="decimal"/>
+      <w:lvlText w:val="%1.%2.%3."/>
+      <w:lvlJc w:val="left"/>
+      <w:pPr>
+        <w:ind w:left="1224" w:hanging="504"/>
+      </w:pPr>
+    </w:lvl>
+    <w:lvl w:ilvl="3">
+      <w:start w:val="1"/>
+      <w:numFmt w:val="decimal"/>
+      <w:lvlText w:val="%1.%2.%3.%4."/>
+      <w:lvlJc w:val="left"/>
+      <w:pPr>
+        <w:ind w:left="1728" w:hanging="648"/>
+      </w:pPr>
+    </w:lvl>
+    <w:lvl w:ilvl="4">
+      <w:start w:val="1"/>
+      <w:numFmt w:val="decimal"/>
+      <w:lvlText w:val="%1.%2.%3.%4.%5."/>
+      <w:lvlJc w:val="left"/>
+      <w:pPr>
+        <w:ind w:left="2232" w:hanging="792"/>
+      </w:pPr>
+    </w:lvl>
+    <w:lvl w:ilvl="5">
+      <w:start w:val="1"/>
+      <w:numFmt w:val="decimal"/>
+      <w:lvlText w:val="%1.%2.%3.%4.%5.%6."/>
+      <w:lvlJc w:val="left"/>
+      <w:pPr>
+        <w:ind w:left="2736" w:hanging="936"/>
+      </w:pPr>
+    </w:lvl>
+    <w:lvl w:ilvl="6">
+      <w:start w:val="1"/>
+      <w:numFmt w:val="decimal"/>
+      <w:lvlText w:val="%1.%2.%3.%4.%5.%6.%7."/>
+      <w:lvlJc w:val="left"/>
+      <w:pPr>
+        <w:ind w:left="3240" w:hanging="1080"/>
+      </w:pPr>
+    </w:lvl>
+    <w:lvl w:ilvl="7">
+      <w:start w:val="1"/>
+      <w:numFmt w:val="decimal"/>
+      <w:lvlText w:val="%1.%2.%3.%4.%5.%6.%7.%8."/>
+      <w:lvlJc w:val="left"/>
+      <w:pPr>
+        <w:ind w:left="3744" w:hanging="1224"/>
+      </w:pPr>
+    </w:lvl>
+    <w:lvl w:ilvl="8">
+      <w:start w:val="1"/>
+      <w:numFmt w:val="decimal"/>
+      <w:lvlText w:val="%1.%2.%3.%4.%5.%6.%7.%8.%9."/>
+      <w:lvlJc w:val="left"/>
+      <w:pPr>
+        <w:ind w:left="4320" w:hanging="1440"/>
+      </w:pPr>
+    </w:lvl>
+  </w:abstractNum>
+  <w:abstractNum w:abstractNumId="2" w15:restartNumberingAfterBreak="0">
+    <w:nsid w:val="46F6053F"/>
+    <w:multiLevelType w:val="multilevel"/>
+    <w:tmpl w:val="04090025"/>
+    <w:lvl w:ilvl="0">
+      <w:start w:val="1"/>
+      <w:numFmt w:val="decimal"/>
+      <w:lvlText w:val="%1"/>
+      <w:lvlJc w:val="left"/>
+      <w:pPr>
+        <w:ind w:left="432" w:hanging="432"/>
+      </w:pPr>
+    </w:lvl>
+    <w:lvl w:ilvl="1">
+      <w:start w:val="1"/>
+      <w:numFmt w:val="decimal"/>
+      <w:lvlText w:val="%1.%2"/>
+      <w:lvlJc w:val="left"/>
+      <w:pPr>
+        <w:ind w:left="576" w:hanging="576"/>
+      </w:pPr>
+    </w:lvl>
+    <w:lvl w:ilvl="2">
+      <w:start w:val="1"/>
+      <w:numFmt w:val="decimal"/>
+      <w:lvlText w:val="%1.%2.%3"/>
+      <w:lvlJc w:val="left"/>
+      <w:pPr>
+        <w:ind w:left="720" w:hanging="720"/>
+      </w:pPr>
+    </w:lvl>
+    <w:lvl w:ilvl="3">
+      <w:start w:val="1"/>
+      <w:numFmt w:val="decimal"/>
+      <w:lvlText w:val="%1.%2.%3.%4"/>
+      <w:lvlJc w:val="left"/>
+      <w:pPr>
+        <w:ind w:left="864" w:hanging="864"/>
+      </w:pPr>
+    </w:lvl>
+    <w:lvl w:ilvl="4">
+      <w:start w:val="1"/>
+      <w:numFmt w:val="decimal"/>
+      <w:lvlText w:val="%1.%2.%3.%4.%5"/>
+      <w:lvlJc w:val="left"/>
+      <w:pPr>
+        <w:ind w:left="1008" w:hanging="1008"/>
+      </w:pPr>
+    </w:lvl>
+    <w:lvl w:ilvl="5">
+      <w:start w:val="1"/>
+      <w:numFmt w:val="decimal"/>
+      <w:lvlText w:val="%1.%2.%3.%4.%5.%6"/>
+      <w:lvlJc w:val="left"/>
+      <w:pPr>
+        <w:ind w:left="1152" w:hanging="1152"/>
+      </w:pPr>
+    </w:lvl>
+    <w:lvl w:ilvl="6">
+      <w:start w:val="1"/>
+      <w:numFmt w:val="decimal"/>
+      <w:lvlText w:val="%1.%2.%3.%4.%5.%6.%7"/>
+      <w:lvlJc w:val="left"/>
+      <w:pPr>
+        <w:ind w:left="1296" w:hanging="1296"/>
+      </w:pPr>
+    </w:lvl>
+    <w:lvl w:ilvl="7">
+      <w:start w:val="1"/>
+      <w:numFmt w:val="decimal"/>
+      <w:lvlText w:val="%1.%2.%3.%4.%5.%6.%7.%8"/>
+      <w:lvlJc w:val="left"/>
+      <w:pPr>
+        <w:ind w:left="1440" w:hanging="1440"/>
+      </w:pPr>
+    </w:lvl>
+    <w:lvl w:ilvl="8">
+      <w:start w:val="1"/>
+      <w:numFmt w:val="decimal"/>
+      <w:lvlText w:val="%1.%2.%3.%4.%5.%6.%7.%8.%9"/>
+      <w:lvlJc w:val="left"/>
+      <w:pPr>
+        <w:ind w:left="1584" w:hanging="1584"/>
+      </w:pPr>
+    </w:lvl>
+  </w:abstractNum>
+  <w:num w:numId="1" w16cid:durableId="2034528544">
+    <w:abstractNumId w:val="0"/>
   </w:num>
 </w:numbering>
 </file>
@@ -3199,7 +3082,7 @@
     <w:autoRedefine/>
     <w:uiPriority w:val="39"/>
     <w:unhideWhenUsed/>
-    <w:rsid w:val="00E66BFD"/>
+    <w:rsid w:val="00132DBA"/>
     <w:pPr>
       <w:spacing w:line="240" w:lineRule="auto" w:before="0" w:after="0"/>
     </w:pPr>
@@ -3216,7 +3099,7 @@
     <w:autoRedefine/>
     <w:uiPriority w:val="39"/>
     <w:unhideWhenUsed/>
-    <w:rsid w:val="00E66BFD"/>
+    <w:rsid w:val="00132DBA"/>
     <w:pPr>
       <w:spacing w:line="240" w:lineRule="auto" w:before="0" w:after="0"/>
       <w:ind w:left="240"/>
@@ -3232,7 +3115,7 @@
     <w:basedOn w:val="DefaultParagraphFont"/>
     <w:uiPriority w:val="99"/>
     <w:unhideWhenUsed/>
-    <w:rsid w:val="00E66BFD"/>
+    <w:rsid w:val="00132DBA"/>
     <w:rPr>
       <w:color w:val="0563C1" w:themeColor="hyperlink"/>
       <w:u w:val="single"/>
@@ -3246,7 +3129,7 @@
     <w:uiPriority w:val="39"/>
     <w:semiHidden/>
     <w:unhideWhenUsed/>
-    <w:rsid w:val="00E66BFD"/>
+    <w:rsid w:val="00132DBA"/>
     <w:pPr>
       <w:spacing w:line="240" w:lineRule="auto" w:before="0" w:after="0"/>
       <w:ind w:left="480"/>
@@ -3265,7 +3148,7 @@
     <w:uiPriority w:val="39"/>
     <w:semiHidden/>
     <w:unhideWhenUsed/>
-    <w:rsid w:val="00E66BFD"/>
+    <w:rsid w:val="00132DBA"/>
     <w:pPr>
       <w:spacing w:line="240" w:lineRule="auto" w:before="0" w:after="0"/>
       <w:ind w:left="720"/>
@@ -3284,7 +3167,7 @@
     <w:uiPriority w:val="39"/>
     <w:semiHidden/>
     <w:unhideWhenUsed/>
-    <w:rsid w:val="00E66BFD"/>
+    <w:rsid w:val="00132DBA"/>
     <w:pPr>
       <w:spacing w:line="240" w:lineRule="auto" w:before="0" w:after="0"/>
       <w:ind w:left="960"/>

</xml_diff>

<commit_message>
Improve PDF generation UX and fix report cover layout
</commit_message>
<xml_diff>
--- a/actual-app/apps/engine/tools/generated_front3_official_test.docx
+++ b/actual-app/apps/engine/tools/generated_front3_official_test.docx
@@ -31,7 +31,7 @@
           <w:noProof/>
         </w:rPr>
         <w:drawing>
-          <wp:inline distT="0" distB="0" distL="0" distR="0" wp14:anchorId="3FB97AF9" wp14:editId="49AF7C98">
+          <wp:inline distT="0" distB="0" distL="0" distR="0" wp14:anchorId="72BAE25C" wp14:editId="068ADA43">
             <wp:extent cx="1133856" cy="1225296"/>
             <wp:effectExtent l="0" t="0" r="0" b="0"/>
             <wp:docPr id="1" name="Picture 1"/>
@@ -42,7 +42,7 @@
               <a:graphicData uri="http://schemas.openxmlformats.org/drawingml/2006/picture">
                 <pic:pic xmlns:pic="http://schemas.openxmlformats.org/drawingml/2006/picture">
                   <pic:nvPicPr>
-                    <pic:cNvPr id="0" name="tmpiqaikwif.png"/>
+                    <pic:cNvPr id="0" name="tmpw98ny_ka.png"/>
                     <pic:cNvPicPr/>
                   </pic:nvPicPr>
                   <pic:blipFill>
@@ -309,7 +309,12 @@
     <w:p>
       <w:pPr>
         <w:pageBreakBefore/>
-        <w:spacing w:after="960" w:line="240" w:lineRule="auto"/>
+        <w:spacing w:line="240" w:lineRule="auto"/>
+      </w:pPr>
+    </w:p>
+    <w:p>
+      <w:pPr>
+        <w:spacing w:before="440" w:after="1040" w:line="240" w:lineRule="auto"/>
         <w:jc w:val="center"/>
       </w:pPr>
       <w:r>
@@ -317,13 +322,12 @@
           <w:smallCaps/>
           <w:sz w:val="52"/>
         </w:rPr>
-        <w:lastRenderedPageBreak/>
         <w:t>Intelligent Campus Attendance System</w:t>
       </w:r>
     </w:p>
     <w:p>
       <w:pPr>
-        <w:spacing w:after="720" w:line="240" w:lineRule="auto"/>
+        <w:spacing w:after="960" w:line="240" w:lineRule="auto"/>
         <w:jc w:val="center"/>
       </w:pPr>
       <w:r>
@@ -504,7 +508,7 @@
     </w:p>
     <w:p>
       <w:pPr>
-        <w:spacing w:before="360" w:line="240" w:lineRule="auto"/>
+        <w:spacing w:before="560" w:line="240" w:lineRule="auto"/>
         <w:jc w:val="left"/>
       </w:pPr>
       <w:r>
@@ -517,12 +521,12 @@
     </w:p>
     <w:p>
       <w:pPr>
-        <w:spacing w:before="1120"/>
-      </w:pPr>
-    </w:p>
-    <w:p>
-      <w:pPr>
-        <w:spacing w:after="1120" w:line="240" w:lineRule="auto"/>
+        <w:spacing w:before="1760"/>
+      </w:pPr>
+    </w:p>
+    <w:p>
+      <w:pPr>
+        <w:spacing w:after="1900" w:line="240" w:lineRule="auto"/>
         <w:jc w:val="center"/>
       </w:pPr>
       <w:r>
@@ -621,7 +625,7 @@
                 <w:noProof/>
               </w:rPr>
               <w:drawing>
-                <wp:inline distT="0" distB="0" distL="0" distR="0" wp14:anchorId="6C4BC0C3" wp14:editId="312EE81C">
+                <wp:inline distT="0" distB="0" distL="0" distR="0" wp14:anchorId="17E3F31D" wp14:editId="1EF270E9">
                   <wp:extent cx="813816" cy="877824"/>
                   <wp:effectExtent l="0" t="0" r="0" b="0"/>
                   <wp:docPr id="2" name="Picture 2"/>
@@ -632,7 +636,7 @@
                     <a:graphicData uri="http://schemas.openxmlformats.org/drawingml/2006/picture">
                       <pic:pic xmlns:pic="http://schemas.openxmlformats.org/drawingml/2006/picture">
                         <pic:nvPicPr>
-                          <pic:cNvPr id="0" name="tmpiqaikwif.png"/>
+                          <pic:cNvPr id="0" name="tmpw98ny_ka.png"/>
                           <pic:cNvPicPr/>
                         </pic:nvPicPr>
                         <pic:blipFill>
@@ -1122,7 +1126,7 @@
         </w:rPr>
         <w:fldChar w:fldCharType="separate"/>
       </w:r>
-      <w:hyperlink w:anchor="_Toc241175786" w:history="1">
+      <w:hyperlink w:anchor="_Toc241240904" w:history="1">
         <w:r>
           <w:rPr>
             <w:rFonts w:ascii="Times New Roman" w:hAnsi="Times New Roman" w:eastAsia="Times New Roman" w:cs="Times New Roman"/>
@@ -1161,7 +1165,7 @@
             <w:sz w:val="20"/>
             <w:szCs w:val="20"/>
           </w:rPr>
-          <w:instrText xml:space="preserve"> PAGEREF _Toc241175786 \h </w:instrText>
+          <w:instrText xml:space="preserve"> PAGEREF _Toc241240904 \h </w:instrText>
         </w:r>
         <w:r>
           <w:rPr>
@@ -1218,7 +1222,7 @@
           <w:sz w:val="24"/>
         </w:rPr>
       </w:pPr>
-      <w:hyperlink w:anchor="_Toc241175787" w:history="1">
+      <w:hyperlink w:anchor="_Toc241240905" w:history="1">
         <w:r>
           <w:rPr>
             <w:rFonts w:ascii="Times New Roman" w:hAnsi="Times New Roman" w:eastAsia="Times New Roman" w:cs="Times New Roman"/>
@@ -1257,7 +1261,7 @@
             <w:sz w:val="20"/>
             <w:szCs w:val="20"/>
           </w:rPr>
-          <w:instrText xml:space="preserve"> PAGEREF _Toc241175787 \h </w:instrText>
+          <w:instrText xml:space="preserve"> PAGEREF _Toc241240905 \h </w:instrText>
         </w:r>
         <w:r>
           <w:rPr>
@@ -1315,7 +1319,7 @@
           <w:sz w:val="24"/>
         </w:rPr>
       </w:pPr>
-      <w:hyperlink w:anchor="_Toc241175788" w:history="1">
+      <w:hyperlink w:anchor="_Toc241240906" w:history="1">
         <w:r>
           <w:rPr>
             <w:rFonts w:ascii="Times New Roman" w:hAnsi="Times New Roman" w:eastAsia="Times New Roman" w:cs="Times New Roman"/>
@@ -1374,7 +1378,7 @@
             <w:sz w:val="20"/>
             <w:szCs w:val="20"/>
           </w:rPr>
-          <w:instrText xml:space="preserve"> PAGEREF _Toc241175788 \h </w:instrText>
+          <w:instrText xml:space="preserve"> PAGEREF _Toc241240906 \h </w:instrText>
         </w:r>
         <w:r>
           <w:rPr>
@@ -1619,7 +1623,7 @@
         </w:pBdr>
         <w:spacing w:after="240"/>
       </w:pPr>
-      <w:bookmarkStart w:id="0" w:name="_Toc241175786"/>
+      <w:bookmarkStart w:id="0" w:name="_Toc241240904"/>
       <w:r>
         <w:rPr>
           <w:rFonts w:ascii="Times New Roman" w:eastAsia="Times New Roman" w:hAnsi="Times New Roman" w:cs="Times New Roman"/>
@@ -1636,7 +1640,7 @@
       <w:pPr>
         <w:pStyle w:val="Heading1"/>
       </w:pPr>
-      <w:bookmarkStart w:id="1" w:name="_Toc241175787"/>
+      <w:bookmarkStart w:id="1" w:name="_Toc241240905"/>
       <w:r>
         <w:rPr>
           <w:rFonts w:ascii="Times New Roman" w:eastAsia="Times New Roman" w:hAnsi="Times New Roman" w:cs="Times New Roman"/>
@@ -1673,7 +1677,7 @@
         </w:numPr>
         <w:spacing w:before="360" w:after="120"/>
       </w:pPr>
-      <w:bookmarkStart w:id="2" w:name="_Toc241175788"/>
+      <w:bookmarkStart w:id="2" w:name="_Toc241240906"/>
       <w:r>
         <w:rPr>
           <w:rFonts w:ascii="Times New Roman" w:eastAsia="Times New Roman" w:hAnsi="Times New Roman" w:cs="Times New Roman"/>
@@ -1841,9 +1845,181 @@
 <file path=word/numbering.xml><?xml version="1.0" encoding="utf-8"?>
 <w:numbering xmlns:wpc="http://schemas.microsoft.com/office/word/2010/wordprocessingCanvas" xmlns:cx="http://schemas.microsoft.com/office/drawing/2014/chartex" xmlns:cx1="http://schemas.microsoft.com/office/drawing/2015/9/8/chartex" xmlns:cx2="http://schemas.microsoft.com/office/drawing/2015/10/21/chartex" xmlns:cx3="http://schemas.microsoft.com/office/drawing/2016/5/9/chartex" xmlns:cx4="http://schemas.microsoft.com/office/drawing/2016/5/10/chartex" xmlns:cx5="http://schemas.microsoft.com/office/drawing/2016/5/11/chartex" xmlns:cx6="http://schemas.microsoft.com/office/drawing/2016/5/12/chartex" xmlns:cx7="http://schemas.microsoft.com/office/drawing/2016/5/13/chartex" xmlns:cx8="http://schemas.microsoft.com/office/drawing/2016/5/14/chartex" xmlns:mc="http://schemas.openxmlformats.org/markup-compatibility/2006" xmlns:aink="http://schemas.microsoft.com/office/drawing/2016/ink" xmlns:am3d="http://schemas.microsoft.com/office/drawing/2017/model3d" xmlns:o="urn:schemas-microsoft-com:office:office" xmlns:oel="http://schemas.microsoft.com/office/2019/extlst" xmlns:r="http://schemas.openxmlformats.org/officeDocument/2006/relationships" xmlns:m="http://schemas.openxmlformats.org/officeDocument/2006/math" xmlns:v="urn:schemas-microsoft-com:vml" xmlns:wp14="http://schemas.microsoft.com/office/word/2010/wordprocessingDrawing" xmlns:wp="http://schemas.openxmlformats.org/drawingml/2006/wordprocessingDrawing" xmlns:w10="urn:schemas-microsoft-com:office:word" xmlns:w="http://schemas.openxmlformats.org/wordprocessingml/2006/main" xmlns:w14="http://schemas.microsoft.com/office/word/2010/wordml" xmlns:w15="http://schemas.microsoft.com/office/word/2012/wordml" xmlns:w16cex="http://schemas.microsoft.com/office/word/2018/wordml/cex" xmlns:w16cid="http://schemas.microsoft.com/office/word/2016/wordml/cid" xmlns:w16="http://schemas.microsoft.com/office/word/2018/wordml" xmlns:w16du="http://schemas.microsoft.com/office/word/2023/wordml/word16du" xmlns:w16sdtdh="http://schemas.microsoft.com/office/word/2020/wordml/sdtdatahash" xmlns:w16sdtfl="http://schemas.microsoft.com/office/word/2024/wordml/sdtformatlock" xmlns:w16se="http://schemas.microsoft.com/office/word/2015/wordml/symex" xmlns:wpg="http://schemas.microsoft.com/office/word/2010/wordprocessingGroup" xmlns:wpi="http://schemas.microsoft.com/office/word/2010/wordprocessingInk" xmlns:wne="http://schemas.microsoft.com/office/word/2006/wordml" xmlns:wps="http://schemas.microsoft.com/office/word/2010/wordprocessingShape" mc:Ignorable="w14 w15 w16se w16cid w16 w16cex w16sdtdh w16sdtfl w16du wp14">
   <w:abstractNum w:abstractNumId="0" w15:restartNumberingAfterBreak="0">
-    <w:nsid w:val="07A337C9"/>
+    <w:nsid w:val="143B4FB5"/>
     <w:multiLevelType w:val="multilevel"/>
-    <w:tmpl w:val="D6C2508C"/>
+    <w:tmpl w:val="0409001F"/>
+    <w:lvl w:ilvl="0">
+      <w:start w:val="1"/>
+      <w:numFmt w:val="decimal"/>
+      <w:lvlText w:val="%1."/>
+      <w:lvlJc w:val="left"/>
+      <w:pPr>
+        <w:ind w:left="360" w:hanging="360"/>
+      </w:pPr>
+    </w:lvl>
+    <w:lvl w:ilvl="1">
+      <w:start w:val="1"/>
+      <w:numFmt w:val="decimal"/>
+      <w:lvlText w:val="%1.%2."/>
+      <w:lvlJc w:val="left"/>
+      <w:pPr>
+        <w:ind w:left="792" w:hanging="432"/>
+      </w:pPr>
+    </w:lvl>
+    <w:lvl w:ilvl="2">
+      <w:start w:val="1"/>
+      <w:numFmt w:val="decimal"/>
+      <w:lvlText w:val="%1.%2.%3."/>
+      <w:lvlJc w:val="left"/>
+      <w:pPr>
+        <w:ind w:left="1224" w:hanging="504"/>
+      </w:pPr>
+    </w:lvl>
+    <w:lvl w:ilvl="3">
+      <w:start w:val="1"/>
+      <w:numFmt w:val="decimal"/>
+      <w:lvlText w:val="%1.%2.%3.%4."/>
+      <w:lvlJc w:val="left"/>
+      <w:pPr>
+        <w:ind w:left="1728" w:hanging="648"/>
+      </w:pPr>
+    </w:lvl>
+    <w:lvl w:ilvl="4">
+      <w:start w:val="1"/>
+      <w:numFmt w:val="decimal"/>
+      <w:lvlText w:val="%1.%2.%3.%4.%5."/>
+      <w:lvlJc w:val="left"/>
+      <w:pPr>
+        <w:ind w:left="2232" w:hanging="792"/>
+      </w:pPr>
+    </w:lvl>
+    <w:lvl w:ilvl="5">
+      <w:start w:val="1"/>
+      <w:numFmt w:val="decimal"/>
+      <w:lvlText w:val="%1.%2.%3.%4.%5.%6."/>
+      <w:lvlJc w:val="left"/>
+      <w:pPr>
+        <w:ind w:left="2736" w:hanging="936"/>
+      </w:pPr>
+    </w:lvl>
+    <w:lvl w:ilvl="6">
+      <w:start w:val="1"/>
+      <w:numFmt w:val="decimal"/>
+      <w:lvlText w:val="%1.%2.%3.%4.%5.%6.%7."/>
+      <w:lvlJc w:val="left"/>
+      <w:pPr>
+        <w:ind w:left="3240" w:hanging="1080"/>
+      </w:pPr>
+    </w:lvl>
+    <w:lvl w:ilvl="7">
+      <w:start w:val="1"/>
+      <w:numFmt w:val="decimal"/>
+      <w:lvlText w:val="%1.%2.%3.%4.%5.%6.%7.%8."/>
+      <w:lvlJc w:val="left"/>
+      <w:pPr>
+        <w:ind w:left="3744" w:hanging="1224"/>
+      </w:pPr>
+    </w:lvl>
+    <w:lvl w:ilvl="8">
+      <w:start w:val="1"/>
+      <w:numFmt w:val="decimal"/>
+      <w:lvlText w:val="%1.%2.%3.%4.%5.%6.%7.%8.%9."/>
+      <w:lvlJc w:val="left"/>
+      <w:pPr>
+        <w:ind w:left="4320" w:hanging="1440"/>
+      </w:pPr>
+    </w:lvl>
+  </w:abstractNum>
+  <w:abstractNum w:abstractNumId="1" w15:restartNumberingAfterBreak="0">
+    <w:nsid w:val="46F6053F"/>
+    <w:multiLevelType w:val="multilevel"/>
+    <w:tmpl w:val="04090025"/>
+    <w:lvl w:ilvl="0">
+      <w:start w:val="1"/>
+      <w:numFmt w:val="decimal"/>
+      <w:lvlText w:val="%1"/>
+      <w:lvlJc w:val="left"/>
+      <w:pPr>
+        <w:ind w:left="432" w:hanging="432"/>
+      </w:pPr>
+    </w:lvl>
+    <w:lvl w:ilvl="1">
+      <w:start w:val="1"/>
+      <w:numFmt w:val="decimal"/>
+      <w:lvlText w:val="%1.%2"/>
+      <w:lvlJc w:val="left"/>
+      <w:pPr>
+        <w:ind w:left="576" w:hanging="576"/>
+      </w:pPr>
+    </w:lvl>
+    <w:lvl w:ilvl="2">
+      <w:start w:val="1"/>
+      <w:numFmt w:val="decimal"/>
+      <w:lvlText w:val="%1.%2.%3"/>
+      <w:lvlJc w:val="left"/>
+      <w:pPr>
+        <w:ind w:left="720" w:hanging="720"/>
+      </w:pPr>
+    </w:lvl>
+    <w:lvl w:ilvl="3">
+      <w:start w:val="1"/>
+      <w:numFmt w:val="decimal"/>
+      <w:lvlText w:val="%1.%2.%3.%4"/>
+      <w:lvlJc w:val="left"/>
+      <w:pPr>
+        <w:ind w:left="864" w:hanging="864"/>
+      </w:pPr>
+    </w:lvl>
+    <w:lvl w:ilvl="4">
+      <w:start w:val="1"/>
+      <w:numFmt w:val="decimal"/>
+      <w:lvlText w:val="%1.%2.%3.%4.%5"/>
+      <w:lvlJc w:val="left"/>
+      <w:pPr>
+        <w:ind w:left="1008" w:hanging="1008"/>
+      </w:pPr>
+    </w:lvl>
+    <w:lvl w:ilvl="5">
+      <w:start w:val="1"/>
+      <w:numFmt w:val="decimal"/>
+      <w:lvlText w:val="%1.%2.%3.%4.%5.%6"/>
+      <w:lvlJc w:val="left"/>
+      <w:pPr>
+        <w:ind w:left="1152" w:hanging="1152"/>
+      </w:pPr>
+    </w:lvl>
+    <w:lvl w:ilvl="6">
+      <w:start w:val="1"/>
+      <w:numFmt w:val="decimal"/>
+      <w:lvlText w:val="%1.%2.%3.%4.%5.%6.%7"/>
+      <w:lvlJc w:val="left"/>
+      <w:pPr>
+        <w:ind w:left="1296" w:hanging="1296"/>
+      </w:pPr>
+    </w:lvl>
+    <w:lvl w:ilvl="7">
+      <w:start w:val="1"/>
+      <w:numFmt w:val="decimal"/>
+      <w:lvlText w:val="%1.%2.%3.%4.%5.%6.%7.%8"/>
+      <w:lvlJc w:val="left"/>
+      <w:pPr>
+        <w:ind w:left="1440" w:hanging="1440"/>
+      </w:pPr>
+    </w:lvl>
+    <w:lvl w:ilvl="8">
+      <w:start w:val="1"/>
+      <w:numFmt w:val="decimal"/>
+      <w:lvlText w:val="%1.%2.%3.%4.%5.%6.%7.%8.%9"/>
+      <w:lvlJc w:val="left"/>
+      <w:pPr>
+        <w:ind w:left="1584" w:hanging="1584"/>
+      </w:pPr>
+    </w:lvl>
+  </w:abstractNum>
+  <w:abstractNum w:abstractNumId="2" w15:restartNumberingAfterBreak="0">
+    <w:nsid w:val="7EFB4805"/>
+    <w:multiLevelType w:val="multilevel"/>
+    <w:tmpl w:val="54F8447C"/>
     <w:lvl w:ilvl="0">
       <w:start w:val="1"/>
       <w:numFmt w:val="decimal"/>
@@ -1919,180 +2095,8 @@
       <w:lvlJc w:val="left"/>
     </w:lvl>
   </w:abstractNum>
-  <w:abstractNum w:abstractNumId="1" w15:restartNumberingAfterBreak="0">
-    <w:nsid w:val="143B4FB5"/>
-    <w:multiLevelType w:val="multilevel"/>
-    <w:tmpl w:val="0409001F"/>
-    <w:lvl w:ilvl="0">
-      <w:start w:val="1"/>
-      <w:numFmt w:val="decimal"/>
-      <w:lvlText w:val="%1."/>
-      <w:lvlJc w:val="left"/>
-      <w:pPr>
-        <w:ind w:left="360" w:hanging="360"/>
-      </w:pPr>
-    </w:lvl>
-    <w:lvl w:ilvl="1">
-      <w:start w:val="1"/>
-      <w:numFmt w:val="decimal"/>
-      <w:lvlText w:val="%1.%2."/>
-      <w:lvlJc w:val="left"/>
-      <w:pPr>
-        <w:ind w:left="792" w:hanging="432"/>
-      </w:pPr>
-    </w:lvl>
-    <w:lvl w:ilvl="2">
-      <w:start w:val="1"/>
-      <w:numFmt w:val="decimal"/>
-      <w:lvlText w:val="%1.%2.%3."/>
-      <w:lvlJc w:val="left"/>
-      <w:pPr>
-        <w:ind w:left="1224" w:hanging="504"/>
-      </w:pPr>
-    </w:lvl>
-    <w:lvl w:ilvl="3">
-      <w:start w:val="1"/>
-      <w:numFmt w:val="decimal"/>
-      <w:lvlText w:val="%1.%2.%3.%4."/>
-      <w:lvlJc w:val="left"/>
-      <w:pPr>
-        <w:ind w:left="1728" w:hanging="648"/>
-      </w:pPr>
-    </w:lvl>
-    <w:lvl w:ilvl="4">
-      <w:start w:val="1"/>
-      <w:numFmt w:val="decimal"/>
-      <w:lvlText w:val="%1.%2.%3.%4.%5."/>
-      <w:lvlJc w:val="left"/>
-      <w:pPr>
-        <w:ind w:left="2232" w:hanging="792"/>
-      </w:pPr>
-    </w:lvl>
-    <w:lvl w:ilvl="5">
-      <w:start w:val="1"/>
-      <w:numFmt w:val="decimal"/>
-      <w:lvlText w:val="%1.%2.%3.%4.%5.%6."/>
-      <w:lvlJc w:val="left"/>
-      <w:pPr>
-        <w:ind w:left="2736" w:hanging="936"/>
-      </w:pPr>
-    </w:lvl>
-    <w:lvl w:ilvl="6">
-      <w:start w:val="1"/>
-      <w:numFmt w:val="decimal"/>
-      <w:lvlText w:val="%1.%2.%3.%4.%5.%6.%7."/>
-      <w:lvlJc w:val="left"/>
-      <w:pPr>
-        <w:ind w:left="3240" w:hanging="1080"/>
-      </w:pPr>
-    </w:lvl>
-    <w:lvl w:ilvl="7">
-      <w:start w:val="1"/>
-      <w:numFmt w:val="decimal"/>
-      <w:lvlText w:val="%1.%2.%3.%4.%5.%6.%7.%8."/>
-      <w:lvlJc w:val="left"/>
-      <w:pPr>
-        <w:ind w:left="3744" w:hanging="1224"/>
-      </w:pPr>
-    </w:lvl>
-    <w:lvl w:ilvl="8">
-      <w:start w:val="1"/>
-      <w:numFmt w:val="decimal"/>
-      <w:lvlText w:val="%1.%2.%3.%4.%5.%6.%7.%8.%9."/>
-      <w:lvlJc w:val="left"/>
-      <w:pPr>
-        <w:ind w:left="4320" w:hanging="1440"/>
-      </w:pPr>
-    </w:lvl>
-  </w:abstractNum>
-  <w:abstractNum w:abstractNumId="2" w15:restartNumberingAfterBreak="0">
-    <w:nsid w:val="46F6053F"/>
-    <w:multiLevelType w:val="multilevel"/>
-    <w:tmpl w:val="04090025"/>
-    <w:lvl w:ilvl="0">
-      <w:start w:val="1"/>
-      <w:numFmt w:val="decimal"/>
-      <w:lvlText w:val="%1"/>
-      <w:lvlJc w:val="left"/>
-      <w:pPr>
-        <w:ind w:left="432" w:hanging="432"/>
-      </w:pPr>
-    </w:lvl>
-    <w:lvl w:ilvl="1">
-      <w:start w:val="1"/>
-      <w:numFmt w:val="decimal"/>
-      <w:lvlText w:val="%1.%2"/>
-      <w:lvlJc w:val="left"/>
-      <w:pPr>
-        <w:ind w:left="576" w:hanging="576"/>
-      </w:pPr>
-    </w:lvl>
-    <w:lvl w:ilvl="2">
-      <w:start w:val="1"/>
-      <w:numFmt w:val="decimal"/>
-      <w:lvlText w:val="%1.%2.%3"/>
-      <w:lvlJc w:val="left"/>
-      <w:pPr>
-        <w:ind w:left="720" w:hanging="720"/>
-      </w:pPr>
-    </w:lvl>
-    <w:lvl w:ilvl="3">
-      <w:start w:val="1"/>
-      <w:numFmt w:val="decimal"/>
-      <w:lvlText w:val="%1.%2.%3.%4"/>
-      <w:lvlJc w:val="left"/>
-      <w:pPr>
-        <w:ind w:left="864" w:hanging="864"/>
-      </w:pPr>
-    </w:lvl>
-    <w:lvl w:ilvl="4">
-      <w:start w:val="1"/>
-      <w:numFmt w:val="decimal"/>
-      <w:lvlText w:val="%1.%2.%3.%4.%5"/>
-      <w:lvlJc w:val="left"/>
-      <w:pPr>
-        <w:ind w:left="1008" w:hanging="1008"/>
-      </w:pPr>
-    </w:lvl>
-    <w:lvl w:ilvl="5">
-      <w:start w:val="1"/>
-      <w:numFmt w:val="decimal"/>
-      <w:lvlText w:val="%1.%2.%3.%4.%5.%6"/>
-      <w:lvlJc w:val="left"/>
-      <w:pPr>
-        <w:ind w:left="1152" w:hanging="1152"/>
-      </w:pPr>
-    </w:lvl>
-    <w:lvl w:ilvl="6">
-      <w:start w:val="1"/>
-      <w:numFmt w:val="decimal"/>
-      <w:lvlText w:val="%1.%2.%3.%4.%5.%6.%7"/>
-      <w:lvlJc w:val="left"/>
-      <w:pPr>
-        <w:ind w:left="1296" w:hanging="1296"/>
-      </w:pPr>
-    </w:lvl>
-    <w:lvl w:ilvl="7">
-      <w:start w:val="1"/>
-      <w:numFmt w:val="decimal"/>
-      <w:lvlText w:val="%1.%2.%3.%4.%5.%6.%7.%8"/>
-      <w:lvlJc w:val="left"/>
-      <w:pPr>
-        <w:ind w:left="1440" w:hanging="1440"/>
-      </w:pPr>
-    </w:lvl>
-    <w:lvl w:ilvl="8">
-      <w:start w:val="1"/>
-      <w:numFmt w:val="decimal"/>
-      <w:lvlText w:val="%1.%2.%3.%4.%5.%6.%7.%8.%9"/>
-      <w:lvlJc w:val="left"/>
-      <w:pPr>
-        <w:ind w:left="1584" w:hanging="1584"/>
-      </w:pPr>
-    </w:lvl>
-  </w:abstractNum>
-  <w:num w:numId="1" w16cid:durableId="2034528544">
-    <w:abstractNumId w:val="0"/>
+  <w:num w:numId="1" w16cid:durableId="856581574">
+    <w:abstractNumId w:val="2"/>
   </w:num>
 </w:numbering>
 </file>
@@ -3082,7 +3086,7 @@
     <w:autoRedefine/>
     <w:uiPriority w:val="39"/>
     <w:unhideWhenUsed/>
-    <w:rsid w:val="00132DBA"/>
+    <w:rsid w:val="007B7BC6"/>
     <w:pPr>
       <w:spacing w:line="240" w:lineRule="auto" w:before="0" w:after="0"/>
     </w:pPr>
@@ -3099,7 +3103,7 @@
     <w:autoRedefine/>
     <w:uiPriority w:val="39"/>
     <w:unhideWhenUsed/>
-    <w:rsid w:val="00132DBA"/>
+    <w:rsid w:val="007B7BC6"/>
     <w:pPr>
       <w:spacing w:line="240" w:lineRule="auto" w:before="0" w:after="0"/>
       <w:ind w:left="240"/>
@@ -3115,7 +3119,7 @@
     <w:basedOn w:val="DefaultParagraphFont"/>
     <w:uiPriority w:val="99"/>
     <w:unhideWhenUsed/>
-    <w:rsid w:val="00132DBA"/>
+    <w:rsid w:val="007B7BC6"/>
     <w:rPr>
       <w:color w:val="0563C1" w:themeColor="hyperlink"/>
       <w:u w:val="single"/>
@@ -3129,7 +3133,7 @@
     <w:uiPriority w:val="39"/>
     <w:semiHidden/>
     <w:unhideWhenUsed/>
-    <w:rsid w:val="00132DBA"/>
+    <w:rsid w:val="007B7BC6"/>
     <w:pPr>
       <w:spacing w:line="240" w:lineRule="auto" w:before="0" w:after="0"/>
       <w:ind w:left="480"/>
@@ -3148,7 +3152,7 @@
     <w:uiPriority w:val="39"/>
     <w:semiHidden/>
     <w:unhideWhenUsed/>
-    <w:rsid w:val="00132DBA"/>
+    <w:rsid w:val="007B7BC6"/>
     <w:pPr>
       <w:spacing w:line="240" w:lineRule="auto" w:before="0" w:after="0"/>
       <w:ind w:left="720"/>
@@ -3167,7 +3171,7 @@
     <w:uiPriority w:val="39"/>
     <w:semiHidden/>
     <w:unhideWhenUsed/>
-    <w:rsid w:val="00132DBA"/>
+    <w:rsid w:val="007B7BC6"/>
     <w:pPr>
       <w:spacing w:line="240" w:lineRule="auto" w:before="0" w:after="0"/>
       <w:ind w:left="960"/>

</xml_diff>